<commit_message>
feat: add director_fio_genitive migration, update handlers and docs templates
</commit_message>
<xml_diff>
--- a/docs/Акт_расчета_ИП.docx
+++ b/docs/Акт_расчета_ИП.docx
@@ -1,36 +1,8 @@
 
 <file path=word/document.xml><?xml version="1.0" encoding="utf-8"?>
-<w:document xmlns:wpc="http://schemas.microsoft.com/office/word/2010/wordprocessingCanvas" xmlns:cx="http://schemas.microsoft.com/office/drawing/2014/chartex" xmlns:cx1="http://schemas.microsoft.com/office/drawing/2015/9/8/chartex" xmlns:cx2="http://schemas.microsoft.com/office/drawing/2015/10/21/chartex" xmlns:cx3="http://schemas.microsoft.com/office/drawing/2016/5/9/chartex" xmlns:cx4="http://schemas.microsoft.com/office/drawing/2016/5/10/chartex" xmlns:cx5="http://schemas.microsoft.com/office/drawing/2016/5/11/chartex" xmlns:cx6="http://schemas.microsoft.com/office/drawing/2016/5/12/chartex" xmlns:cx7="http://schemas.microsoft.com/office/drawing/2016/5/13/chartex" xmlns:cx8="http://schemas.microsoft.com/office/drawing/2016/5/14/chartex" xmlns:mc="http://schemas.openxmlformats.org/markup-compatibility/2006" xmlns:aink="http://schemas.microsoft.com/office/drawing/2016/ink" xmlns:am3d="http://schemas.microsoft.com/office/drawing/2017/model3d" xmlns:o="urn:schemas-microsoft-com:office:office" xmlns:oel="http://schemas.microsoft.com/office/2019/extlst" xmlns:r="http://schemas.openxmlformats.org/officeDocument/2006/relationships" xmlns:m="http://schemas.openxmlformats.org/officeDocument/2006/math" xmlns:v="urn:schemas-microsoft-com:vml" xmlns:wp14="http://schemas.microsoft.com/office/word/2010/wordprocessingDrawing" xmlns:wp="http://schemas.openxmlformats.org/drawingml/2006/wordprocessingDrawing" xmlns:w10="urn:schemas-microsoft-com:office:word" xmlns:w="http://schemas.openxmlformats.org/wordprocessingml/2006/main" xmlns:w14="http://schemas.microsoft.com/office/word/2010/wordml" xmlns:w15="http://schemas.microsoft.com/office/word/2012/wordml" xmlns:w16cex="http://schemas.microsoft.com/office/word/2018/wordml/cex" xmlns:w16cid="http://schemas.microsoft.com/office/word/2016/wordml/cid" xmlns:w16="http://schemas.microsoft.com/office/word/2018/wordml" xmlns:w16du="http://schemas.microsoft.com/office/word/2023/wordml/word16du" xmlns:w16sdtdh="http://schemas.microsoft.com/office/word/2020/wordml/sdtdatahash" xmlns:w16sdtfl="http://schemas.microsoft.com/office/word/2024/wordml/sdtformatlock" xmlns:w16se="http://schemas.microsoft.com/office/word/2015/wordml/symex" xmlns:wpg="http://schemas.microsoft.com/office/word/2010/wordprocessingGroup" xmlns:wpi="http://schemas.microsoft.com/office/word/2010/wordprocessingInk" xmlns:wne="http://schemas.microsoft.com/office/word/2006/wordml" xmlns:wps="http://schemas.microsoft.com/office/word/2010/wordprocessingShape" mc:Ignorable="w14 w15 w16se w16cid w16 w16cex w16sdtdh w16sdtfl w16du wp14">
+<w:document xmlns:wpc="http://schemas.microsoft.com/office/word/2010/wordprocessingCanvas" xmlns:cx="http://schemas.microsoft.com/office/drawing/2014/chartex" xmlns:cx1="http://schemas.microsoft.com/office/drawing/2015/9/8/chartex" xmlns:cx2="http://schemas.microsoft.com/office/drawing/2015/10/21/chartex" xmlns:cx3="http://schemas.microsoft.com/office/drawing/2016/5/9/chartex" xmlns:cx4="http://schemas.microsoft.com/office/drawing/2016/5/10/chartex" xmlns:cx5="http://schemas.microsoft.com/office/drawing/2016/5/11/chartex" xmlns:cx6="http://schemas.microsoft.com/office/drawing/2016/5/12/chartex" xmlns:cx7="http://schemas.microsoft.com/office/drawing/2016/5/13/chartex" xmlns:cx8="http://schemas.microsoft.com/office/drawing/2016/5/14/chartex" xmlns:mc="http://schemas.openxmlformats.org/markup-compatibility/2006" xmlns:aink="http://schemas.microsoft.com/office/drawing/2016/ink" xmlns:am3d="http://schemas.microsoft.com/office/drawing/2017/model3d" xmlns:o="urn:schemas-microsoft-com:office:office" xmlns:r="http://schemas.openxmlformats.org/officeDocument/2006/relationships" xmlns:m="http://schemas.openxmlformats.org/officeDocument/2006/math" xmlns:v="urn:schemas-microsoft-com:vml" xmlns:wp14="http://schemas.microsoft.com/office/word/2010/wordprocessingDrawing" xmlns:wp="http://schemas.openxmlformats.org/drawingml/2006/wordprocessingDrawing" xmlns:w10="urn:schemas-microsoft-com:office:word" xmlns:w="http://schemas.openxmlformats.org/wordprocessingml/2006/main" xmlns:w14="http://schemas.microsoft.com/office/word/2010/wordml" xmlns:w15="http://schemas.microsoft.com/office/word/2012/wordml" xmlns:w16cex="http://schemas.microsoft.com/office/word/2018/wordml/cex" xmlns:w16cid="http://schemas.microsoft.com/office/word/2016/wordml/cid" xmlns:w16="http://schemas.microsoft.com/office/word/2018/wordml" xmlns:w16sdtdh="http://schemas.microsoft.com/office/word/2020/wordml/sdtdatahash" xmlns:w16se="http://schemas.microsoft.com/office/word/2015/wordml/symex" xmlns:wpg="http://schemas.microsoft.com/office/word/2010/wordprocessingGroup" xmlns:wpi="http://schemas.microsoft.com/office/word/2010/wordprocessingInk" xmlns:wne="http://schemas.microsoft.com/office/word/2006/wordml" xmlns:wps="http://schemas.microsoft.com/office/word/2010/wordprocessingShape" mc:Ignorable="w14 w15 w16se w16cid w16 w16cex w16sdtdh wp14">
   <w:background w:color="FFFFFF"/>
   <w:body>
-    <w:p>
-      <w:pPr>
-        <w:widowControl w:val="0"/>
-        <w:suppressAutoHyphens w:val="0"/>
-        <w:spacing w:after="0" w:line="240" w:lineRule="auto"/>
-        <w:jc w:val="right"/>
-        <w:rPr>
-          <w:rFonts w:ascii="Times New Roman" w:hAnsi="Times New Roman" w:cs="Times New Roman"/>
-          <w:sz w:val="20"/>
-          <w:szCs w:val="20"/>
-          <w:lang w:eastAsia="ru-RU"/>
-        </w:rPr>
-      </w:pPr>
-    </w:p>
-    <w:p>
-      <w:pPr>
-        <w:widowControl w:val="0"/>
-        <w:suppressAutoHyphens w:val="0"/>
-        <w:spacing w:after="0" w:line="240" w:lineRule="auto"/>
-        <w:jc w:val="right"/>
-        <w:rPr>
-          <w:rFonts w:ascii="Times New Roman" w:hAnsi="Times New Roman" w:cs="Times New Roman"/>
-          <w:sz w:val="20"/>
-          <w:szCs w:val="20"/>
-          <w:lang w:eastAsia="ru-RU"/>
-        </w:rPr>
-      </w:pPr>
-    </w:p>
     <w:p>
       <w:pPr>
         <w:widowControl w:val="0"/>
@@ -156,7 +128,23 @@
                 <w:rFonts w:ascii="Times New Roman" w:hAnsi="Times New Roman"/>
                 <w:sz w:val="24"/>
               </w:rPr>
-              <w:t xml:space="preserve">              thisday.</w:t>
+              <w:t xml:space="preserve">              </w:t>
+            </w:r>
+            <w:proofErr w:type="spellStart"/>
+            <w:r>
+              <w:rPr>
+                <w:rFonts w:ascii="Times New Roman" w:hAnsi="Times New Roman"/>
+                <w:sz w:val="24"/>
+              </w:rPr>
+              <w:t>thisday</w:t>
+            </w:r>
+            <w:proofErr w:type="spellEnd"/>
+            <w:r>
+              <w:rPr>
+                <w:rFonts w:ascii="Times New Roman" w:hAnsi="Times New Roman"/>
+                <w:sz w:val="24"/>
+              </w:rPr>
+              <w:t>.</w:t>
             </w:r>
           </w:p>
         </w:tc>
@@ -225,7 +213,23 @@
           <w:rFonts w:ascii="Times New Roman" w:hAnsi="Times New Roman"/>
           <w:sz w:val="24"/>
         </w:rPr>
-        <w:t>Индивидуальный предприниматель tenant_fio, именуемый в дальнейшем «Арендатор», с другой стороны,</w:t>
+        <w:t xml:space="preserve">Индивидуальный предприниматель </w:t>
+      </w:r>
+      <w:proofErr w:type="spellStart"/>
+      <w:r>
+        <w:rPr>
+          <w:rFonts w:ascii="Times New Roman" w:hAnsi="Times New Roman"/>
+          <w:sz w:val="24"/>
+        </w:rPr>
+        <w:t>tenant_fio</w:t>
+      </w:r>
+      <w:proofErr w:type="spellEnd"/>
+      <w:r>
+        <w:rPr>
+          <w:rFonts w:ascii="Times New Roman" w:hAnsi="Times New Roman"/>
+          <w:sz w:val="24"/>
+        </w:rPr>
+        <w:t>, именуемый в дальнейшем «Арендатор», с другой стороны,</w:t>
       </w:r>
     </w:p>
     <w:p>
@@ -290,7 +294,48 @@
           <w:rFonts w:ascii="Times New Roman" w:hAnsi="Times New Roman"/>
           <w:sz w:val="24"/>
         </w:rPr>
-        <w:t>1. Арендодатель обеспечил оказание, а Арендатор потребил за период с start_day. по end_day. следующие коммунальные услуги:</w:t>
+        <w:t xml:space="preserve">1. Арендодатель обеспечил оказание, а Арендатор потребил за период с </w:t>
+      </w:r>
+      <w:proofErr w:type="spellStart"/>
+      <w:r>
+        <w:rPr>
+          <w:rFonts w:ascii="Times New Roman" w:hAnsi="Times New Roman"/>
+          <w:sz w:val="24"/>
+        </w:rPr>
+        <w:t>start_day</w:t>
+      </w:r>
+      <w:proofErr w:type="spellEnd"/>
+      <w:r>
+        <w:rPr>
+          <w:rFonts w:ascii="Times New Roman" w:hAnsi="Times New Roman"/>
+          <w:sz w:val="24"/>
+        </w:rPr>
+        <w:t xml:space="preserve">. по </w:t>
+      </w:r>
+      <w:proofErr w:type="spellStart"/>
+      <w:r>
+        <w:rPr>
+          <w:rFonts w:ascii="Times New Roman" w:hAnsi="Times New Roman"/>
+          <w:sz w:val="24"/>
+        </w:rPr>
+        <w:t>end_day</w:t>
+      </w:r>
+      <w:proofErr w:type="spellEnd"/>
+      <w:proofErr w:type="gramStart"/>
+      <w:r>
+        <w:rPr>
+          <w:rFonts w:ascii="Times New Roman" w:hAnsi="Times New Roman"/>
+          <w:sz w:val="24"/>
+        </w:rPr>
+        <w:t>.</w:t>
+      </w:r>
+      <w:proofErr w:type="gramEnd"/>
+      <w:r>
+        <w:rPr>
+          <w:rFonts w:ascii="Times New Roman" w:hAnsi="Times New Roman"/>
+          <w:sz w:val="24"/>
+        </w:rPr>
+        <w:t xml:space="preserve"> следующие коммунальные услуги:</w:t>
       </w:r>
     </w:p>
     <w:p>
@@ -309,6 +354,7 @@
       </w:pPr>
     </w:p>
     <w:p>
+      <w:proofErr w:type="spellStart"/>
       <w:r>
         <w:rPr>
           <w:rFonts w:ascii="Times New Roman" w:hAnsi="Times New Roman"/>
@@ -316,6 +362,7 @@
         </w:rPr>
         <w:t>Table_readings</w:t>
       </w:r>
+      <w:proofErr w:type="spellEnd"/>
     </w:p>
     <w:p>
       <w:pPr>
@@ -351,7 +398,55 @@
           <w:rFonts w:ascii="Times New Roman" w:hAnsi="Times New Roman"/>
           <w:sz w:val="24"/>
         </w:rPr>
-        <w:t xml:space="preserve">2. Количество (объем) и стоимость потребленных Арендатором коммунальных услуг определены на основании полученных Арендодателем счетов ресурсоснабжающих организаций за monthyear. пропорционально размеру площади помещения, занимаемого Арендатором: square.            </w:t>
+        <w:t xml:space="preserve">2. Количество (объем) и стоимость потребленных Арендатором коммунальных услуг определены на основании полученных Арендодателем счетов </w:t>
+      </w:r>
+      <w:proofErr w:type="spellStart"/>
+      <w:r>
+        <w:rPr>
+          <w:rFonts w:ascii="Times New Roman" w:hAnsi="Times New Roman"/>
+          <w:sz w:val="24"/>
+        </w:rPr>
+        <w:t>ресурсоснабжающих</w:t>
+      </w:r>
+      <w:proofErr w:type="spellEnd"/>
+      <w:r>
+        <w:rPr>
+          <w:rFonts w:ascii="Times New Roman" w:hAnsi="Times New Roman"/>
+          <w:sz w:val="24"/>
+        </w:rPr>
+        <w:t xml:space="preserve"> организаций за </w:t>
+      </w:r>
+      <w:proofErr w:type="spellStart"/>
+      <w:r>
+        <w:rPr>
+          <w:rFonts w:ascii="Times New Roman" w:hAnsi="Times New Roman"/>
+          <w:sz w:val="24"/>
+        </w:rPr>
+        <w:t>monthyear</w:t>
+      </w:r>
+      <w:proofErr w:type="spellEnd"/>
+      <w:r>
+        <w:rPr>
+          <w:rFonts w:ascii="Times New Roman" w:hAnsi="Times New Roman"/>
+          <w:sz w:val="24"/>
+        </w:rPr>
+        <w:t xml:space="preserve">. пропорционально размеру площади помещения, занимаемого Арендатором: </w:t>
+      </w:r>
+      <w:proofErr w:type="spellStart"/>
+      <w:r>
+        <w:rPr>
+          <w:rFonts w:ascii="Times New Roman" w:hAnsi="Times New Roman"/>
+          <w:sz w:val="24"/>
+        </w:rPr>
+        <w:t>square</w:t>
+      </w:r>
+      <w:proofErr w:type="spellEnd"/>
+      <w:r>
+        <w:rPr>
+          <w:rFonts w:ascii="Times New Roman" w:hAnsi="Times New Roman"/>
+          <w:sz w:val="24"/>
+        </w:rPr>
+        <w:t xml:space="preserve">.            </w:t>
       </w:r>
     </w:p>
     <w:p>
@@ -412,7 +507,23 @@
           <w:rFonts w:ascii="Times New Roman" w:hAnsi="Times New Roman"/>
           <w:color w:val="000000"/>
         </w:rPr>
-        <w:t>Копии счетов ресурсоснабжающих организаций предоставляется по запросу</w:t>
+        <w:t xml:space="preserve">Копии счетов </w:t>
+      </w:r>
+      <w:proofErr w:type="spellStart"/>
+      <w:r>
+        <w:rPr>
+          <w:rFonts w:ascii="Times New Roman" w:hAnsi="Times New Roman"/>
+          <w:color w:val="000000"/>
+        </w:rPr>
+        <w:t>ресурсоснабжающих</w:t>
+      </w:r>
+      <w:proofErr w:type="spellEnd"/>
+      <w:r>
+        <w:rPr>
+          <w:rFonts w:ascii="Times New Roman" w:hAnsi="Times New Roman"/>
+          <w:color w:val="000000"/>
+        </w:rPr>
+        <w:t xml:space="preserve"> организаций предоставляется по запросу</w:t>
       </w:r>
     </w:p>
     <w:p>
@@ -602,9 +713,37 @@
           <w:sz w:val="24"/>
         </w:rPr>
         <w:t>___________________/Попова Я.В./</w:t>
+      </w:r>
+      <w:r>
+        <w:rPr>
+          <w:rFonts w:ascii="Times New Roman" w:hAnsi="Times New Roman"/>
+          <w:sz w:val="24"/>
+        </w:rPr>
         <w:tab/>
+      </w:r>
+      <w:r>
+        <w:rPr>
+          <w:rFonts w:ascii="Times New Roman" w:hAnsi="Times New Roman"/>
+          <w:sz w:val="24"/>
+        </w:rPr>
         <w:tab/>
-        <w:t>_______________ / tenantshortsfp /</w:t>
+        <w:t xml:space="preserve">_______________ / </w:t>
+      </w:r>
+      <w:proofErr w:type="spellStart"/>
+      <w:r>
+        <w:rPr>
+          <w:rFonts w:ascii="Times New Roman" w:hAnsi="Times New Roman"/>
+          <w:sz w:val="24"/>
+        </w:rPr>
+        <w:t>tenantshortsfp</w:t>
+      </w:r>
+      <w:proofErr w:type="spellEnd"/>
+      <w:r>
+        <w:rPr>
+          <w:rFonts w:ascii="Times New Roman" w:hAnsi="Times New Roman"/>
+          <w:sz w:val="24"/>
+        </w:rPr>
+        <w:t xml:space="preserve"> /</w:t>
       </w:r>
     </w:p>
     <w:sectPr>
@@ -625,7 +764,7 @@
 </file>
 
 <file path=word/endnotes.xml><?xml version="1.0" encoding="utf-8"?>
-<w:endnotes xmlns:wpc="http://schemas.microsoft.com/office/word/2010/wordprocessingCanvas" xmlns:cx="http://schemas.microsoft.com/office/drawing/2014/chartex" xmlns:cx1="http://schemas.microsoft.com/office/drawing/2015/9/8/chartex" xmlns:cx2="http://schemas.microsoft.com/office/drawing/2015/10/21/chartex" xmlns:cx3="http://schemas.microsoft.com/office/drawing/2016/5/9/chartex" xmlns:cx4="http://schemas.microsoft.com/office/drawing/2016/5/10/chartex" xmlns:cx5="http://schemas.microsoft.com/office/drawing/2016/5/11/chartex" xmlns:cx6="http://schemas.microsoft.com/office/drawing/2016/5/12/chartex" xmlns:cx7="http://schemas.microsoft.com/office/drawing/2016/5/13/chartex" xmlns:cx8="http://schemas.microsoft.com/office/drawing/2016/5/14/chartex" xmlns:mc="http://schemas.openxmlformats.org/markup-compatibility/2006" xmlns:aink="http://schemas.microsoft.com/office/drawing/2016/ink" xmlns:am3d="http://schemas.microsoft.com/office/drawing/2017/model3d" xmlns:o="urn:schemas-microsoft-com:office:office" xmlns:oel="http://schemas.microsoft.com/office/2019/extlst" xmlns:r="http://schemas.openxmlformats.org/officeDocument/2006/relationships" xmlns:m="http://schemas.openxmlformats.org/officeDocument/2006/math" xmlns:v="urn:schemas-microsoft-com:vml" xmlns:wp14="http://schemas.microsoft.com/office/word/2010/wordprocessingDrawing" xmlns:wp="http://schemas.openxmlformats.org/drawingml/2006/wordprocessingDrawing" xmlns:w10="urn:schemas-microsoft-com:office:word" xmlns:w="http://schemas.openxmlformats.org/wordprocessingml/2006/main" xmlns:w14="http://schemas.microsoft.com/office/word/2010/wordml" xmlns:w15="http://schemas.microsoft.com/office/word/2012/wordml" xmlns:w16cex="http://schemas.microsoft.com/office/word/2018/wordml/cex" xmlns:w16cid="http://schemas.microsoft.com/office/word/2016/wordml/cid" xmlns:w16="http://schemas.microsoft.com/office/word/2018/wordml" xmlns:w16du="http://schemas.microsoft.com/office/word/2023/wordml/word16du" xmlns:w16sdtdh="http://schemas.microsoft.com/office/word/2020/wordml/sdtdatahash" xmlns:w16sdtfl="http://schemas.microsoft.com/office/word/2024/wordml/sdtformatlock" xmlns:w16se="http://schemas.microsoft.com/office/word/2015/wordml/symex" xmlns:wpg="http://schemas.microsoft.com/office/word/2010/wordprocessingGroup" xmlns:wpi="http://schemas.microsoft.com/office/word/2010/wordprocessingInk" xmlns:wne="http://schemas.microsoft.com/office/word/2006/wordml" xmlns:wps="http://schemas.microsoft.com/office/word/2010/wordprocessingShape" mc:Ignorable="w14 w15 w16se w16cid w16 w16cex w16sdtdh w16sdtfl w16du wp14">
+<w:endnotes xmlns:wpc="http://schemas.microsoft.com/office/word/2010/wordprocessingCanvas" xmlns:cx="http://schemas.microsoft.com/office/drawing/2014/chartex" xmlns:cx1="http://schemas.microsoft.com/office/drawing/2015/9/8/chartex" xmlns:cx2="http://schemas.microsoft.com/office/drawing/2015/10/21/chartex" xmlns:cx3="http://schemas.microsoft.com/office/drawing/2016/5/9/chartex" xmlns:cx4="http://schemas.microsoft.com/office/drawing/2016/5/10/chartex" xmlns:cx5="http://schemas.microsoft.com/office/drawing/2016/5/11/chartex" xmlns:cx6="http://schemas.microsoft.com/office/drawing/2016/5/12/chartex" xmlns:cx7="http://schemas.microsoft.com/office/drawing/2016/5/13/chartex" xmlns:cx8="http://schemas.microsoft.com/office/drawing/2016/5/14/chartex" xmlns:mc="http://schemas.openxmlformats.org/markup-compatibility/2006" xmlns:aink="http://schemas.microsoft.com/office/drawing/2016/ink" xmlns:am3d="http://schemas.microsoft.com/office/drawing/2017/model3d" xmlns:o="urn:schemas-microsoft-com:office:office" xmlns:r="http://schemas.openxmlformats.org/officeDocument/2006/relationships" xmlns:m="http://schemas.openxmlformats.org/officeDocument/2006/math" xmlns:v="urn:schemas-microsoft-com:vml" xmlns:wp14="http://schemas.microsoft.com/office/word/2010/wordprocessingDrawing" xmlns:wp="http://schemas.openxmlformats.org/drawingml/2006/wordprocessingDrawing" xmlns:w10="urn:schemas-microsoft-com:office:word" xmlns:w="http://schemas.openxmlformats.org/wordprocessingml/2006/main" xmlns:w14="http://schemas.microsoft.com/office/word/2010/wordml" xmlns:w15="http://schemas.microsoft.com/office/word/2012/wordml" xmlns:w16cex="http://schemas.microsoft.com/office/word/2018/wordml/cex" xmlns:w16cid="http://schemas.microsoft.com/office/word/2016/wordml/cid" xmlns:w16="http://schemas.microsoft.com/office/word/2018/wordml" xmlns:w16sdtdh="http://schemas.microsoft.com/office/word/2020/wordml/sdtdatahash" xmlns:w16se="http://schemas.microsoft.com/office/word/2015/wordml/symex" xmlns:wpg="http://schemas.microsoft.com/office/word/2010/wordprocessingGroup" xmlns:wpi="http://schemas.microsoft.com/office/word/2010/wordprocessingInk" xmlns:wne="http://schemas.microsoft.com/office/word/2006/wordml" xmlns:wps="http://schemas.microsoft.com/office/word/2010/wordprocessingShape" mc:Ignorable="w14 w15 w16se w16cid w16 w16cex w16sdtdh wp14">
   <w:endnote w:type="separator" w:id="-1">
     <w:p>
       <w:pPr>
@@ -650,7 +789,7 @@
 </file>
 
 <file path=word/footer1.xml><?xml version="1.0" encoding="utf-8"?>
-<w:ftr xmlns:wpc="http://schemas.microsoft.com/office/word/2010/wordprocessingCanvas" xmlns:cx="http://schemas.microsoft.com/office/drawing/2014/chartex" xmlns:cx1="http://schemas.microsoft.com/office/drawing/2015/9/8/chartex" xmlns:cx2="http://schemas.microsoft.com/office/drawing/2015/10/21/chartex" xmlns:cx3="http://schemas.microsoft.com/office/drawing/2016/5/9/chartex" xmlns:cx4="http://schemas.microsoft.com/office/drawing/2016/5/10/chartex" xmlns:cx5="http://schemas.microsoft.com/office/drawing/2016/5/11/chartex" xmlns:cx6="http://schemas.microsoft.com/office/drawing/2016/5/12/chartex" xmlns:cx7="http://schemas.microsoft.com/office/drawing/2016/5/13/chartex" xmlns:cx8="http://schemas.microsoft.com/office/drawing/2016/5/14/chartex" xmlns:mc="http://schemas.openxmlformats.org/markup-compatibility/2006" xmlns:aink="http://schemas.microsoft.com/office/drawing/2016/ink" xmlns:am3d="http://schemas.microsoft.com/office/drawing/2017/model3d" xmlns:o="urn:schemas-microsoft-com:office:office" xmlns:oel="http://schemas.microsoft.com/office/2019/extlst" xmlns:r="http://schemas.openxmlformats.org/officeDocument/2006/relationships" xmlns:m="http://schemas.openxmlformats.org/officeDocument/2006/math" xmlns:v="urn:schemas-microsoft-com:vml" xmlns:wp14="http://schemas.microsoft.com/office/word/2010/wordprocessingDrawing" xmlns:wp="http://schemas.openxmlformats.org/drawingml/2006/wordprocessingDrawing" xmlns:w10="urn:schemas-microsoft-com:office:word" xmlns:w="http://schemas.openxmlformats.org/wordprocessingml/2006/main" xmlns:w14="http://schemas.microsoft.com/office/word/2010/wordml" xmlns:w15="http://schemas.microsoft.com/office/word/2012/wordml" xmlns:w16cex="http://schemas.microsoft.com/office/word/2018/wordml/cex" xmlns:w16cid="http://schemas.microsoft.com/office/word/2016/wordml/cid" xmlns:w16="http://schemas.microsoft.com/office/word/2018/wordml" xmlns:w16du="http://schemas.microsoft.com/office/word/2023/wordml/word16du" xmlns:w16sdtdh="http://schemas.microsoft.com/office/word/2020/wordml/sdtdatahash" xmlns:w16sdtfl="http://schemas.microsoft.com/office/word/2024/wordml/sdtformatlock" xmlns:w16se="http://schemas.microsoft.com/office/word/2015/wordml/symex" xmlns:wpg="http://schemas.microsoft.com/office/word/2010/wordprocessingGroup" xmlns:wpi="http://schemas.microsoft.com/office/word/2010/wordprocessingInk" xmlns:wne="http://schemas.microsoft.com/office/word/2006/wordml" xmlns:wps="http://schemas.microsoft.com/office/word/2010/wordprocessingShape" mc:Ignorable="w14 w15 w16se w16cid w16 w16cex w16sdtdh w16sdtfl w16du wp14">
+<w:ftr xmlns:wpc="http://schemas.microsoft.com/office/word/2010/wordprocessingCanvas" xmlns:cx="http://schemas.microsoft.com/office/drawing/2014/chartex" xmlns:cx1="http://schemas.microsoft.com/office/drawing/2015/9/8/chartex" xmlns:cx2="http://schemas.microsoft.com/office/drawing/2015/10/21/chartex" xmlns:cx3="http://schemas.microsoft.com/office/drawing/2016/5/9/chartex" xmlns:cx4="http://schemas.microsoft.com/office/drawing/2016/5/10/chartex" xmlns:cx5="http://schemas.microsoft.com/office/drawing/2016/5/11/chartex" xmlns:cx6="http://schemas.microsoft.com/office/drawing/2016/5/12/chartex" xmlns:cx7="http://schemas.microsoft.com/office/drawing/2016/5/13/chartex" xmlns:cx8="http://schemas.microsoft.com/office/drawing/2016/5/14/chartex" xmlns:mc="http://schemas.openxmlformats.org/markup-compatibility/2006" xmlns:aink="http://schemas.microsoft.com/office/drawing/2016/ink" xmlns:am3d="http://schemas.microsoft.com/office/drawing/2017/model3d" xmlns:o="urn:schemas-microsoft-com:office:office" xmlns:r="http://schemas.openxmlformats.org/officeDocument/2006/relationships" xmlns:m="http://schemas.openxmlformats.org/officeDocument/2006/math" xmlns:v="urn:schemas-microsoft-com:vml" xmlns:wp14="http://schemas.microsoft.com/office/word/2010/wordprocessingDrawing" xmlns:wp="http://schemas.openxmlformats.org/drawingml/2006/wordprocessingDrawing" xmlns:w10="urn:schemas-microsoft-com:office:word" xmlns:w="http://schemas.openxmlformats.org/wordprocessingml/2006/main" xmlns:w14="http://schemas.microsoft.com/office/word/2010/wordml" xmlns:w15="http://schemas.microsoft.com/office/word/2012/wordml" xmlns:w16cex="http://schemas.microsoft.com/office/word/2018/wordml/cex" xmlns:w16cid="http://schemas.microsoft.com/office/word/2016/wordml/cid" xmlns:w16="http://schemas.microsoft.com/office/word/2018/wordml" xmlns:w16sdtdh="http://schemas.microsoft.com/office/word/2020/wordml/sdtdatahash" xmlns:w16se="http://schemas.microsoft.com/office/word/2015/wordml/symex" xmlns:wpg="http://schemas.microsoft.com/office/word/2010/wordprocessingGroup" xmlns:wpi="http://schemas.microsoft.com/office/word/2010/wordprocessingInk" xmlns:wne="http://schemas.microsoft.com/office/word/2006/wordml" xmlns:wps="http://schemas.microsoft.com/office/word/2010/wordprocessingShape" mc:Ignorable="w14 w15 w16se w16cid w16 w16cex w16sdtdh wp14">
   <w:p>
     <w:pPr>
       <w:pStyle w:val="af5"/>
@@ -660,7 +799,7 @@
 </file>
 
 <file path=word/footer2.xml><?xml version="1.0" encoding="utf-8"?>
-<w:ftr xmlns:wpc="http://schemas.microsoft.com/office/word/2010/wordprocessingCanvas" xmlns:cx="http://schemas.microsoft.com/office/drawing/2014/chartex" xmlns:cx1="http://schemas.microsoft.com/office/drawing/2015/9/8/chartex" xmlns:cx2="http://schemas.microsoft.com/office/drawing/2015/10/21/chartex" xmlns:cx3="http://schemas.microsoft.com/office/drawing/2016/5/9/chartex" xmlns:cx4="http://schemas.microsoft.com/office/drawing/2016/5/10/chartex" xmlns:cx5="http://schemas.microsoft.com/office/drawing/2016/5/11/chartex" xmlns:cx6="http://schemas.microsoft.com/office/drawing/2016/5/12/chartex" xmlns:cx7="http://schemas.microsoft.com/office/drawing/2016/5/13/chartex" xmlns:cx8="http://schemas.microsoft.com/office/drawing/2016/5/14/chartex" xmlns:mc="http://schemas.openxmlformats.org/markup-compatibility/2006" xmlns:aink="http://schemas.microsoft.com/office/drawing/2016/ink" xmlns:am3d="http://schemas.microsoft.com/office/drawing/2017/model3d" xmlns:o="urn:schemas-microsoft-com:office:office" xmlns:oel="http://schemas.microsoft.com/office/2019/extlst" xmlns:r="http://schemas.openxmlformats.org/officeDocument/2006/relationships" xmlns:m="http://schemas.openxmlformats.org/officeDocument/2006/math" xmlns:v="urn:schemas-microsoft-com:vml" xmlns:wp14="http://schemas.microsoft.com/office/word/2010/wordprocessingDrawing" xmlns:wp="http://schemas.openxmlformats.org/drawingml/2006/wordprocessingDrawing" xmlns:w10="urn:schemas-microsoft-com:office:word" xmlns:w="http://schemas.openxmlformats.org/wordprocessingml/2006/main" xmlns:w14="http://schemas.microsoft.com/office/word/2010/wordml" xmlns:w15="http://schemas.microsoft.com/office/word/2012/wordml" xmlns:w16cex="http://schemas.microsoft.com/office/word/2018/wordml/cex" xmlns:w16cid="http://schemas.microsoft.com/office/word/2016/wordml/cid" xmlns:w16="http://schemas.microsoft.com/office/word/2018/wordml" xmlns:w16du="http://schemas.microsoft.com/office/word/2023/wordml/word16du" xmlns:w16sdtdh="http://schemas.microsoft.com/office/word/2020/wordml/sdtdatahash" xmlns:w16sdtfl="http://schemas.microsoft.com/office/word/2024/wordml/sdtformatlock" xmlns:w16se="http://schemas.microsoft.com/office/word/2015/wordml/symex" xmlns:wpg="http://schemas.microsoft.com/office/word/2010/wordprocessingGroup" xmlns:wpi="http://schemas.microsoft.com/office/word/2010/wordprocessingInk" xmlns:wne="http://schemas.microsoft.com/office/word/2006/wordml" xmlns:wps="http://schemas.microsoft.com/office/word/2010/wordprocessingShape" mc:Ignorable="w14 w15 w16se w16cid w16 w16cex w16sdtdh w16sdtfl w16du wp14">
+<w:ftr xmlns:wpc="http://schemas.microsoft.com/office/word/2010/wordprocessingCanvas" xmlns:cx="http://schemas.microsoft.com/office/drawing/2014/chartex" xmlns:cx1="http://schemas.microsoft.com/office/drawing/2015/9/8/chartex" xmlns:cx2="http://schemas.microsoft.com/office/drawing/2015/10/21/chartex" xmlns:cx3="http://schemas.microsoft.com/office/drawing/2016/5/9/chartex" xmlns:cx4="http://schemas.microsoft.com/office/drawing/2016/5/10/chartex" xmlns:cx5="http://schemas.microsoft.com/office/drawing/2016/5/11/chartex" xmlns:cx6="http://schemas.microsoft.com/office/drawing/2016/5/12/chartex" xmlns:cx7="http://schemas.microsoft.com/office/drawing/2016/5/13/chartex" xmlns:cx8="http://schemas.microsoft.com/office/drawing/2016/5/14/chartex" xmlns:mc="http://schemas.openxmlformats.org/markup-compatibility/2006" xmlns:aink="http://schemas.microsoft.com/office/drawing/2016/ink" xmlns:am3d="http://schemas.microsoft.com/office/drawing/2017/model3d" xmlns:o="urn:schemas-microsoft-com:office:office" xmlns:r="http://schemas.openxmlformats.org/officeDocument/2006/relationships" xmlns:m="http://schemas.openxmlformats.org/officeDocument/2006/math" xmlns:v="urn:schemas-microsoft-com:vml" xmlns:wp14="http://schemas.microsoft.com/office/word/2010/wordprocessingDrawing" xmlns:wp="http://schemas.openxmlformats.org/drawingml/2006/wordprocessingDrawing" xmlns:w10="urn:schemas-microsoft-com:office:word" xmlns:w="http://schemas.openxmlformats.org/wordprocessingml/2006/main" xmlns:w14="http://schemas.microsoft.com/office/word/2010/wordml" xmlns:w15="http://schemas.microsoft.com/office/word/2012/wordml" xmlns:w16cex="http://schemas.microsoft.com/office/word/2018/wordml/cex" xmlns:w16cid="http://schemas.microsoft.com/office/word/2016/wordml/cid" xmlns:w16="http://schemas.microsoft.com/office/word/2018/wordml" xmlns:w16sdtdh="http://schemas.microsoft.com/office/word/2020/wordml/sdtdatahash" xmlns:w16se="http://schemas.microsoft.com/office/word/2015/wordml/symex" xmlns:wpg="http://schemas.microsoft.com/office/word/2010/wordprocessingGroup" xmlns:wpi="http://schemas.microsoft.com/office/word/2010/wordprocessingInk" xmlns:wne="http://schemas.microsoft.com/office/word/2006/wordml" xmlns:wps="http://schemas.microsoft.com/office/word/2010/wordprocessingShape" mc:Ignorable="w14 w15 w16se w16cid w16 w16cex w16sdtdh wp14">
   <w:p>
     <w:pPr>
       <w:pStyle w:val="af5"/>
@@ -677,7 +816,7 @@
       <mc:AlternateContent>
         <mc:Choice Requires="wps">
           <w:drawing>
-            <wp:anchor distT="0" distB="0" distL="0" distR="0" simplePos="0" relativeHeight="251657216" behindDoc="1" locked="0" layoutInCell="0" allowOverlap="1" wp14:anchorId="721E0B52" wp14:editId="05A52C99">
+            <wp:anchor distT="0" distB="0" distL="0" distR="0" simplePos="0" relativeHeight="251657216" behindDoc="1" locked="0" layoutInCell="0" allowOverlap="1" wp14:anchorId="4515EF12" wp14:editId="75816778">
               <wp:simplePos x="0" y="0"/>
               <wp:positionH relativeFrom="margin">
                 <wp:align>right</wp:align>
@@ -775,7 +914,7 @@
             </wp:anchor>
           </w:drawing>
         </mc:Choice>
-        <mc:Fallback>
+        <mc:Fallback xmlns:w16sdtfl="http://schemas.microsoft.com/office/word/2024/wordml/sdtformatlock" xmlns:w16du="http://schemas.microsoft.com/office/word/2023/wordml/word16du" xmlns:oel="http://schemas.microsoft.com/office/2019/extlst">
           <w:pict>
             <v:rect w14:anchorId="721E0B52" id="Frame1" o:spid="_x0000_s1026" style="position:absolute;margin-left:-45.55pt;margin-top:.05pt;width:5.65pt;height:13.35pt;z-index:-251659264;visibility:visible;mso-wrap-style:square;mso-wrap-distance-left:0;mso-wrap-distance-top:0;mso-wrap-distance-right:0;mso-wrap-distance-bottom:0;mso-position-horizontal:right;mso-position-horizontal-relative:margin;mso-position-vertical:absolute;mso-position-vertical-relative:text;v-text-anchor:top" o:gfxdata="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" o:allowincell="f" filled="f" stroked="f" strokeweight="0">
               <v:textbox style="mso-fit-shape-to-text:t" inset="0,0,0,0">
@@ -836,7 +975,7 @@
 </file>
 
 <file path=word/footer3.xml><?xml version="1.0" encoding="utf-8"?>
-<w:ftr xmlns:wpc="http://schemas.microsoft.com/office/word/2010/wordprocessingCanvas" xmlns:cx="http://schemas.microsoft.com/office/drawing/2014/chartex" xmlns:cx1="http://schemas.microsoft.com/office/drawing/2015/9/8/chartex" xmlns:cx2="http://schemas.microsoft.com/office/drawing/2015/10/21/chartex" xmlns:cx3="http://schemas.microsoft.com/office/drawing/2016/5/9/chartex" xmlns:cx4="http://schemas.microsoft.com/office/drawing/2016/5/10/chartex" xmlns:cx5="http://schemas.microsoft.com/office/drawing/2016/5/11/chartex" xmlns:cx6="http://schemas.microsoft.com/office/drawing/2016/5/12/chartex" xmlns:cx7="http://schemas.microsoft.com/office/drawing/2016/5/13/chartex" xmlns:cx8="http://schemas.microsoft.com/office/drawing/2016/5/14/chartex" xmlns:mc="http://schemas.openxmlformats.org/markup-compatibility/2006" xmlns:aink="http://schemas.microsoft.com/office/drawing/2016/ink" xmlns:am3d="http://schemas.microsoft.com/office/drawing/2017/model3d" xmlns:o="urn:schemas-microsoft-com:office:office" xmlns:oel="http://schemas.microsoft.com/office/2019/extlst" xmlns:r="http://schemas.openxmlformats.org/officeDocument/2006/relationships" xmlns:m="http://schemas.openxmlformats.org/officeDocument/2006/math" xmlns:v="urn:schemas-microsoft-com:vml" xmlns:wp14="http://schemas.microsoft.com/office/word/2010/wordprocessingDrawing" xmlns:wp="http://schemas.openxmlformats.org/drawingml/2006/wordprocessingDrawing" xmlns:w10="urn:schemas-microsoft-com:office:word" xmlns:w="http://schemas.openxmlformats.org/wordprocessingml/2006/main" xmlns:w14="http://schemas.microsoft.com/office/word/2010/wordml" xmlns:w15="http://schemas.microsoft.com/office/word/2012/wordml" xmlns:w16cex="http://schemas.microsoft.com/office/word/2018/wordml/cex" xmlns:w16cid="http://schemas.microsoft.com/office/word/2016/wordml/cid" xmlns:w16="http://schemas.microsoft.com/office/word/2018/wordml" xmlns:w16du="http://schemas.microsoft.com/office/word/2023/wordml/word16du" xmlns:w16sdtdh="http://schemas.microsoft.com/office/word/2020/wordml/sdtdatahash" xmlns:w16sdtfl="http://schemas.microsoft.com/office/word/2024/wordml/sdtformatlock" xmlns:w16se="http://schemas.microsoft.com/office/word/2015/wordml/symex" xmlns:wpg="http://schemas.microsoft.com/office/word/2010/wordprocessingGroup" xmlns:wpi="http://schemas.microsoft.com/office/word/2010/wordprocessingInk" xmlns:wne="http://schemas.microsoft.com/office/word/2006/wordml" xmlns:wps="http://schemas.microsoft.com/office/word/2010/wordprocessingShape" mc:Ignorable="w14 w15 w16se w16cid w16 w16cex w16sdtdh w16sdtfl w16du wp14">
+<w:ftr xmlns:wpc="http://schemas.microsoft.com/office/word/2010/wordprocessingCanvas" xmlns:cx="http://schemas.microsoft.com/office/drawing/2014/chartex" xmlns:cx1="http://schemas.microsoft.com/office/drawing/2015/9/8/chartex" xmlns:cx2="http://schemas.microsoft.com/office/drawing/2015/10/21/chartex" xmlns:cx3="http://schemas.microsoft.com/office/drawing/2016/5/9/chartex" xmlns:cx4="http://schemas.microsoft.com/office/drawing/2016/5/10/chartex" xmlns:cx5="http://schemas.microsoft.com/office/drawing/2016/5/11/chartex" xmlns:cx6="http://schemas.microsoft.com/office/drawing/2016/5/12/chartex" xmlns:cx7="http://schemas.microsoft.com/office/drawing/2016/5/13/chartex" xmlns:cx8="http://schemas.microsoft.com/office/drawing/2016/5/14/chartex" xmlns:mc="http://schemas.openxmlformats.org/markup-compatibility/2006" xmlns:aink="http://schemas.microsoft.com/office/drawing/2016/ink" xmlns:am3d="http://schemas.microsoft.com/office/drawing/2017/model3d" xmlns:o="urn:schemas-microsoft-com:office:office" xmlns:r="http://schemas.openxmlformats.org/officeDocument/2006/relationships" xmlns:m="http://schemas.openxmlformats.org/officeDocument/2006/math" xmlns:v="urn:schemas-microsoft-com:vml" xmlns:wp14="http://schemas.microsoft.com/office/word/2010/wordprocessingDrawing" xmlns:wp="http://schemas.openxmlformats.org/drawingml/2006/wordprocessingDrawing" xmlns:w10="urn:schemas-microsoft-com:office:word" xmlns:w="http://schemas.openxmlformats.org/wordprocessingml/2006/main" xmlns:w14="http://schemas.microsoft.com/office/word/2010/wordml" xmlns:w15="http://schemas.microsoft.com/office/word/2012/wordml" xmlns:w16cex="http://schemas.microsoft.com/office/word/2018/wordml/cex" xmlns:w16cid="http://schemas.microsoft.com/office/word/2016/wordml/cid" xmlns:w16="http://schemas.microsoft.com/office/word/2018/wordml" xmlns:w16sdtdh="http://schemas.microsoft.com/office/word/2020/wordml/sdtdatahash" xmlns:w16se="http://schemas.microsoft.com/office/word/2015/wordml/symex" xmlns:wpg="http://schemas.microsoft.com/office/word/2010/wordprocessingGroup" xmlns:wpi="http://schemas.microsoft.com/office/word/2010/wordprocessingInk" xmlns:wne="http://schemas.microsoft.com/office/word/2006/wordml" xmlns:wps="http://schemas.microsoft.com/office/word/2010/wordprocessingShape" mc:Ignorable="w14 w15 w16se w16cid w16 w16cex w16sdtdh wp14">
   <w:p>
     <w:pPr>
       <w:pStyle w:val="af5"/>
@@ -853,7 +992,7 @@
       <mc:AlternateContent>
         <mc:Choice Requires="wps">
           <w:drawing>
-            <wp:anchor distT="0" distB="0" distL="0" distR="0" simplePos="0" relativeHeight="251658240" behindDoc="1" locked="0" layoutInCell="0" allowOverlap="1" wp14:anchorId="2CAC9AF6" wp14:editId="74C19DBD">
+            <wp:anchor distT="0" distB="0" distL="0" distR="0" simplePos="0" relativeHeight="251658240" behindDoc="1" locked="0" layoutInCell="0" allowOverlap="1" wp14:anchorId="41627623" wp14:editId="795AEF05">
               <wp:simplePos x="0" y="0"/>
               <wp:positionH relativeFrom="margin">
                 <wp:align>right</wp:align>
@@ -951,7 +1090,7 @@
             </wp:anchor>
           </w:drawing>
         </mc:Choice>
-        <mc:Fallback>
+        <mc:Fallback xmlns:w16sdtfl="http://schemas.microsoft.com/office/word/2024/wordml/sdtformatlock" xmlns:w16du="http://schemas.microsoft.com/office/word/2023/wordml/word16du" xmlns:oel="http://schemas.microsoft.com/office/2019/extlst">
           <w:pict>
             <v:rect w14:anchorId="2CAC9AF6" id="_x0000_s1027" style="position:absolute;margin-left:-45.55pt;margin-top:.05pt;width:5.65pt;height:13.35pt;z-index:-251658240;visibility:visible;mso-wrap-style:square;mso-wrap-distance-left:0;mso-wrap-distance-top:0;mso-wrap-distance-right:0;mso-wrap-distance-bottom:0;mso-position-horizontal:right;mso-position-horizontal-relative:margin;mso-position-vertical:absolute;mso-position-vertical-relative:text;v-text-anchor:top" o:gfxdata="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" o:allowincell="f" filled="f" stroked="f" strokeweight="0">
               <v:textbox style="mso-fit-shape-to-text:t" inset="0,0,0,0">
@@ -1012,7 +1151,7 @@
 </file>
 
 <file path=word/footnotes.xml><?xml version="1.0" encoding="utf-8"?>
-<w:footnotes xmlns:wpc="http://schemas.microsoft.com/office/word/2010/wordprocessingCanvas" xmlns:cx="http://schemas.microsoft.com/office/drawing/2014/chartex" xmlns:cx1="http://schemas.microsoft.com/office/drawing/2015/9/8/chartex" xmlns:cx2="http://schemas.microsoft.com/office/drawing/2015/10/21/chartex" xmlns:cx3="http://schemas.microsoft.com/office/drawing/2016/5/9/chartex" xmlns:cx4="http://schemas.microsoft.com/office/drawing/2016/5/10/chartex" xmlns:cx5="http://schemas.microsoft.com/office/drawing/2016/5/11/chartex" xmlns:cx6="http://schemas.microsoft.com/office/drawing/2016/5/12/chartex" xmlns:cx7="http://schemas.microsoft.com/office/drawing/2016/5/13/chartex" xmlns:cx8="http://schemas.microsoft.com/office/drawing/2016/5/14/chartex" xmlns:mc="http://schemas.openxmlformats.org/markup-compatibility/2006" xmlns:aink="http://schemas.microsoft.com/office/drawing/2016/ink" xmlns:am3d="http://schemas.microsoft.com/office/drawing/2017/model3d" xmlns:o="urn:schemas-microsoft-com:office:office" xmlns:oel="http://schemas.microsoft.com/office/2019/extlst" xmlns:r="http://schemas.openxmlformats.org/officeDocument/2006/relationships" xmlns:m="http://schemas.openxmlformats.org/officeDocument/2006/math" xmlns:v="urn:schemas-microsoft-com:vml" xmlns:wp14="http://schemas.microsoft.com/office/word/2010/wordprocessingDrawing" xmlns:wp="http://schemas.openxmlformats.org/drawingml/2006/wordprocessingDrawing" xmlns:w10="urn:schemas-microsoft-com:office:word" xmlns:w="http://schemas.openxmlformats.org/wordprocessingml/2006/main" xmlns:w14="http://schemas.microsoft.com/office/word/2010/wordml" xmlns:w15="http://schemas.microsoft.com/office/word/2012/wordml" xmlns:w16cex="http://schemas.microsoft.com/office/word/2018/wordml/cex" xmlns:w16cid="http://schemas.microsoft.com/office/word/2016/wordml/cid" xmlns:w16="http://schemas.microsoft.com/office/word/2018/wordml" xmlns:w16du="http://schemas.microsoft.com/office/word/2023/wordml/word16du" xmlns:w16sdtdh="http://schemas.microsoft.com/office/word/2020/wordml/sdtdatahash" xmlns:w16sdtfl="http://schemas.microsoft.com/office/word/2024/wordml/sdtformatlock" xmlns:w16se="http://schemas.microsoft.com/office/word/2015/wordml/symex" xmlns:wpg="http://schemas.microsoft.com/office/word/2010/wordprocessingGroup" xmlns:wpi="http://schemas.microsoft.com/office/word/2010/wordprocessingInk" xmlns:wne="http://schemas.microsoft.com/office/word/2006/wordml" xmlns:wps="http://schemas.microsoft.com/office/word/2010/wordprocessingShape" mc:Ignorable="w14 w15 w16se w16cid w16 w16cex w16sdtdh w16sdtfl w16du wp14">
+<w:footnotes xmlns:wpc="http://schemas.microsoft.com/office/word/2010/wordprocessingCanvas" xmlns:cx="http://schemas.microsoft.com/office/drawing/2014/chartex" xmlns:cx1="http://schemas.microsoft.com/office/drawing/2015/9/8/chartex" xmlns:cx2="http://schemas.microsoft.com/office/drawing/2015/10/21/chartex" xmlns:cx3="http://schemas.microsoft.com/office/drawing/2016/5/9/chartex" xmlns:cx4="http://schemas.microsoft.com/office/drawing/2016/5/10/chartex" xmlns:cx5="http://schemas.microsoft.com/office/drawing/2016/5/11/chartex" xmlns:cx6="http://schemas.microsoft.com/office/drawing/2016/5/12/chartex" xmlns:cx7="http://schemas.microsoft.com/office/drawing/2016/5/13/chartex" xmlns:cx8="http://schemas.microsoft.com/office/drawing/2016/5/14/chartex" xmlns:mc="http://schemas.openxmlformats.org/markup-compatibility/2006" xmlns:aink="http://schemas.microsoft.com/office/drawing/2016/ink" xmlns:am3d="http://schemas.microsoft.com/office/drawing/2017/model3d" xmlns:o="urn:schemas-microsoft-com:office:office" xmlns:r="http://schemas.openxmlformats.org/officeDocument/2006/relationships" xmlns:m="http://schemas.openxmlformats.org/officeDocument/2006/math" xmlns:v="urn:schemas-microsoft-com:vml" xmlns:wp14="http://schemas.microsoft.com/office/word/2010/wordprocessingDrawing" xmlns:wp="http://schemas.openxmlformats.org/drawingml/2006/wordprocessingDrawing" xmlns:w10="urn:schemas-microsoft-com:office:word" xmlns:w="http://schemas.openxmlformats.org/wordprocessingml/2006/main" xmlns:w14="http://schemas.microsoft.com/office/word/2010/wordml" xmlns:w15="http://schemas.microsoft.com/office/word/2012/wordml" xmlns:w16cex="http://schemas.microsoft.com/office/word/2018/wordml/cex" xmlns:w16cid="http://schemas.microsoft.com/office/word/2016/wordml/cid" xmlns:w16="http://schemas.microsoft.com/office/word/2018/wordml" xmlns:w16sdtdh="http://schemas.microsoft.com/office/word/2020/wordml/sdtdatahash" xmlns:w16se="http://schemas.microsoft.com/office/word/2015/wordml/symex" xmlns:wpg="http://schemas.microsoft.com/office/word/2010/wordprocessingGroup" xmlns:wpi="http://schemas.microsoft.com/office/word/2010/wordprocessingInk" xmlns:wne="http://schemas.microsoft.com/office/word/2006/wordml" xmlns:wps="http://schemas.microsoft.com/office/word/2010/wordprocessingShape" mc:Ignorable="w14 w15 w16se w16cid w16 w16cex w16sdtdh wp14">
   <w:footnote w:type="separator" w:id="-1">
     <w:p>
       <w:pPr>
@@ -1037,7 +1176,7 @@
 </file>
 
 <file path=word/header1.xml><?xml version="1.0" encoding="utf-8"?>
-<w:hdr xmlns:wpc="http://schemas.microsoft.com/office/word/2010/wordprocessingCanvas" xmlns:cx="http://schemas.microsoft.com/office/drawing/2014/chartex" xmlns:cx1="http://schemas.microsoft.com/office/drawing/2015/9/8/chartex" xmlns:cx2="http://schemas.microsoft.com/office/drawing/2015/10/21/chartex" xmlns:cx3="http://schemas.microsoft.com/office/drawing/2016/5/9/chartex" xmlns:cx4="http://schemas.microsoft.com/office/drawing/2016/5/10/chartex" xmlns:cx5="http://schemas.microsoft.com/office/drawing/2016/5/11/chartex" xmlns:cx6="http://schemas.microsoft.com/office/drawing/2016/5/12/chartex" xmlns:cx7="http://schemas.microsoft.com/office/drawing/2016/5/13/chartex" xmlns:cx8="http://schemas.microsoft.com/office/drawing/2016/5/14/chartex" xmlns:mc="http://schemas.openxmlformats.org/markup-compatibility/2006" xmlns:aink="http://schemas.microsoft.com/office/drawing/2016/ink" xmlns:am3d="http://schemas.microsoft.com/office/drawing/2017/model3d" xmlns:o="urn:schemas-microsoft-com:office:office" xmlns:oel="http://schemas.microsoft.com/office/2019/extlst" xmlns:r="http://schemas.openxmlformats.org/officeDocument/2006/relationships" xmlns:m="http://schemas.openxmlformats.org/officeDocument/2006/math" xmlns:v="urn:schemas-microsoft-com:vml" xmlns:wp14="http://schemas.microsoft.com/office/word/2010/wordprocessingDrawing" xmlns:wp="http://schemas.openxmlformats.org/drawingml/2006/wordprocessingDrawing" xmlns:w10="urn:schemas-microsoft-com:office:word" xmlns:w="http://schemas.openxmlformats.org/wordprocessingml/2006/main" xmlns:w14="http://schemas.microsoft.com/office/word/2010/wordml" xmlns:w15="http://schemas.microsoft.com/office/word/2012/wordml" xmlns:w16cex="http://schemas.microsoft.com/office/word/2018/wordml/cex" xmlns:w16cid="http://schemas.microsoft.com/office/word/2016/wordml/cid" xmlns:w16="http://schemas.microsoft.com/office/word/2018/wordml" xmlns:w16du="http://schemas.microsoft.com/office/word/2023/wordml/word16du" xmlns:w16sdtdh="http://schemas.microsoft.com/office/word/2020/wordml/sdtdatahash" xmlns:w16sdtfl="http://schemas.microsoft.com/office/word/2024/wordml/sdtformatlock" xmlns:w16se="http://schemas.microsoft.com/office/word/2015/wordml/symex" xmlns:wpg="http://schemas.microsoft.com/office/word/2010/wordprocessingGroup" xmlns:wpi="http://schemas.microsoft.com/office/word/2010/wordprocessingInk" xmlns:wne="http://schemas.microsoft.com/office/word/2006/wordml" xmlns:wps="http://schemas.microsoft.com/office/word/2010/wordprocessingShape" mc:Ignorable="w14 w15 w16se w16cid w16 w16cex w16sdtdh w16sdtfl w16du wp14">
+<w:hdr xmlns:wpc="http://schemas.microsoft.com/office/word/2010/wordprocessingCanvas" xmlns:cx="http://schemas.microsoft.com/office/drawing/2014/chartex" xmlns:cx1="http://schemas.microsoft.com/office/drawing/2015/9/8/chartex" xmlns:cx2="http://schemas.microsoft.com/office/drawing/2015/10/21/chartex" xmlns:cx3="http://schemas.microsoft.com/office/drawing/2016/5/9/chartex" xmlns:cx4="http://schemas.microsoft.com/office/drawing/2016/5/10/chartex" xmlns:cx5="http://schemas.microsoft.com/office/drawing/2016/5/11/chartex" xmlns:cx6="http://schemas.microsoft.com/office/drawing/2016/5/12/chartex" xmlns:cx7="http://schemas.microsoft.com/office/drawing/2016/5/13/chartex" xmlns:cx8="http://schemas.microsoft.com/office/drawing/2016/5/14/chartex" xmlns:mc="http://schemas.openxmlformats.org/markup-compatibility/2006" xmlns:aink="http://schemas.microsoft.com/office/drawing/2016/ink" xmlns:am3d="http://schemas.microsoft.com/office/drawing/2017/model3d" xmlns:o="urn:schemas-microsoft-com:office:office" xmlns:r="http://schemas.openxmlformats.org/officeDocument/2006/relationships" xmlns:m="http://schemas.openxmlformats.org/officeDocument/2006/math" xmlns:v="urn:schemas-microsoft-com:vml" xmlns:wp14="http://schemas.microsoft.com/office/word/2010/wordprocessingDrawing" xmlns:wp="http://schemas.openxmlformats.org/drawingml/2006/wordprocessingDrawing" xmlns:w10="urn:schemas-microsoft-com:office:word" xmlns:w="http://schemas.openxmlformats.org/wordprocessingml/2006/main" xmlns:w14="http://schemas.microsoft.com/office/word/2010/wordml" xmlns:w15="http://schemas.microsoft.com/office/word/2012/wordml" xmlns:w16cex="http://schemas.microsoft.com/office/word/2018/wordml/cex" xmlns:w16cid="http://schemas.microsoft.com/office/word/2016/wordml/cid" xmlns:w16="http://schemas.microsoft.com/office/word/2018/wordml" xmlns:w16sdtdh="http://schemas.microsoft.com/office/word/2020/wordml/sdtdatahash" xmlns:w16se="http://schemas.microsoft.com/office/word/2015/wordml/symex" xmlns:wpg="http://schemas.microsoft.com/office/word/2010/wordprocessingGroup" xmlns:wpi="http://schemas.microsoft.com/office/word/2010/wordprocessingInk" xmlns:wne="http://schemas.microsoft.com/office/word/2006/wordml" xmlns:wps="http://schemas.microsoft.com/office/word/2010/wordprocessingShape" mc:Ignorable="w14 w15 w16se w16cid w16 w16cex w16sdtdh wp14">
   <w:p>
     <w:pPr>
       <w:pStyle w:val="af3"/>
@@ -1047,7 +1186,7 @@
 </file>
 
 <file path=word/header2.xml><?xml version="1.0" encoding="utf-8"?>
-<w:hdr xmlns:wpc="http://schemas.microsoft.com/office/word/2010/wordprocessingCanvas" xmlns:cx="http://schemas.microsoft.com/office/drawing/2014/chartex" xmlns:cx1="http://schemas.microsoft.com/office/drawing/2015/9/8/chartex" xmlns:cx2="http://schemas.microsoft.com/office/drawing/2015/10/21/chartex" xmlns:cx3="http://schemas.microsoft.com/office/drawing/2016/5/9/chartex" xmlns:cx4="http://schemas.microsoft.com/office/drawing/2016/5/10/chartex" xmlns:cx5="http://schemas.microsoft.com/office/drawing/2016/5/11/chartex" xmlns:cx6="http://schemas.microsoft.com/office/drawing/2016/5/12/chartex" xmlns:cx7="http://schemas.microsoft.com/office/drawing/2016/5/13/chartex" xmlns:cx8="http://schemas.microsoft.com/office/drawing/2016/5/14/chartex" xmlns:mc="http://schemas.openxmlformats.org/markup-compatibility/2006" xmlns:aink="http://schemas.microsoft.com/office/drawing/2016/ink" xmlns:am3d="http://schemas.microsoft.com/office/drawing/2017/model3d" xmlns:o="urn:schemas-microsoft-com:office:office" xmlns:oel="http://schemas.microsoft.com/office/2019/extlst" xmlns:r="http://schemas.openxmlformats.org/officeDocument/2006/relationships" xmlns:m="http://schemas.openxmlformats.org/officeDocument/2006/math" xmlns:v="urn:schemas-microsoft-com:vml" xmlns:wp14="http://schemas.microsoft.com/office/word/2010/wordprocessingDrawing" xmlns:wp="http://schemas.openxmlformats.org/drawingml/2006/wordprocessingDrawing" xmlns:w10="urn:schemas-microsoft-com:office:word" xmlns:w="http://schemas.openxmlformats.org/wordprocessingml/2006/main" xmlns:w14="http://schemas.microsoft.com/office/word/2010/wordml" xmlns:w15="http://schemas.microsoft.com/office/word/2012/wordml" xmlns:w16cex="http://schemas.microsoft.com/office/word/2018/wordml/cex" xmlns:w16cid="http://schemas.microsoft.com/office/word/2016/wordml/cid" xmlns:w16="http://schemas.microsoft.com/office/word/2018/wordml" xmlns:w16du="http://schemas.microsoft.com/office/word/2023/wordml/word16du" xmlns:w16sdtdh="http://schemas.microsoft.com/office/word/2020/wordml/sdtdatahash" xmlns:w16sdtfl="http://schemas.microsoft.com/office/word/2024/wordml/sdtformatlock" xmlns:w16se="http://schemas.microsoft.com/office/word/2015/wordml/symex" xmlns:wpg="http://schemas.microsoft.com/office/word/2010/wordprocessingGroup" xmlns:wpi="http://schemas.microsoft.com/office/word/2010/wordprocessingInk" xmlns:wne="http://schemas.microsoft.com/office/word/2006/wordml" xmlns:wps="http://schemas.microsoft.com/office/word/2010/wordprocessingShape" mc:Ignorable="w14 w15 w16se w16cid w16 w16cex w16sdtdh w16sdtfl w16du wp14">
+<w:hdr xmlns:wpc="http://schemas.microsoft.com/office/word/2010/wordprocessingCanvas" xmlns:cx="http://schemas.microsoft.com/office/drawing/2014/chartex" xmlns:cx1="http://schemas.microsoft.com/office/drawing/2015/9/8/chartex" xmlns:cx2="http://schemas.microsoft.com/office/drawing/2015/10/21/chartex" xmlns:cx3="http://schemas.microsoft.com/office/drawing/2016/5/9/chartex" xmlns:cx4="http://schemas.microsoft.com/office/drawing/2016/5/10/chartex" xmlns:cx5="http://schemas.microsoft.com/office/drawing/2016/5/11/chartex" xmlns:cx6="http://schemas.microsoft.com/office/drawing/2016/5/12/chartex" xmlns:cx7="http://schemas.microsoft.com/office/drawing/2016/5/13/chartex" xmlns:cx8="http://schemas.microsoft.com/office/drawing/2016/5/14/chartex" xmlns:mc="http://schemas.openxmlformats.org/markup-compatibility/2006" xmlns:aink="http://schemas.microsoft.com/office/drawing/2016/ink" xmlns:am3d="http://schemas.microsoft.com/office/drawing/2017/model3d" xmlns:o="urn:schemas-microsoft-com:office:office" xmlns:r="http://schemas.openxmlformats.org/officeDocument/2006/relationships" xmlns:m="http://schemas.openxmlformats.org/officeDocument/2006/math" xmlns:v="urn:schemas-microsoft-com:vml" xmlns:wp14="http://schemas.microsoft.com/office/word/2010/wordprocessingDrawing" xmlns:wp="http://schemas.openxmlformats.org/drawingml/2006/wordprocessingDrawing" xmlns:w10="urn:schemas-microsoft-com:office:word" xmlns:w="http://schemas.openxmlformats.org/wordprocessingml/2006/main" xmlns:w14="http://schemas.microsoft.com/office/word/2010/wordml" xmlns:w15="http://schemas.microsoft.com/office/word/2012/wordml" xmlns:w16cex="http://schemas.microsoft.com/office/word/2018/wordml/cex" xmlns:w16cid="http://schemas.microsoft.com/office/word/2016/wordml/cid" xmlns:w16="http://schemas.microsoft.com/office/word/2018/wordml" xmlns:w16sdtdh="http://schemas.microsoft.com/office/word/2020/wordml/sdtdatahash" xmlns:w16se="http://schemas.microsoft.com/office/word/2015/wordml/symex" xmlns:wpg="http://schemas.microsoft.com/office/word/2010/wordprocessingGroup" xmlns:wpi="http://schemas.microsoft.com/office/word/2010/wordprocessingInk" xmlns:wne="http://schemas.microsoft.com/office/word/2006/wordml" xmlns:wps="http://schemas.microsoft.com/office/word/2010/wordprocessingShape" mc:Ignorable="w14 w15 w16se w16cid w16 w16cex w16sdtdh wp14">
   <w:p>
     <w:pPr>
       <w:pStyle w:val="af3"/>
@@ -1057,7 +1196,7 @@
 </file>
 
 <file path=word/header3.xml><?xml version="1.0" encoding="utf-8"?>
-<w:hdr xmlns:wpc="http://schemas.microsoft.com/office/word/2010/wordprocessingCanvas" xmlns:cx="http://schemas.microsoft.com/office/drawing/2014/chartex" xmlns:cx1="http://schemas.microsoft.com/office/drawing/2015/9/8/chartex" xmlns:cx2="http://schemas.microsoft.com/office/drawing/2015/10/21/chartex" xmlns:cx3="http://schemas.microsoft.com/office/drawing/2016/5/9/chartex" xmlns:cx4="http://schemas.microsoft.com/office/drawing/2016/5/10/chartex" xmlns:cx5="http://schemas.microsoft.com/office/drawing/2016/5/11/chartex" xmlns:cx6="http://schemas.microsoft.com/office/drawing/2016/5/12/chartex" xmlns:cx7="http://schemas.microsoft.com/office/drawing/2016/5/13/chartex" xmlns:cx8="http://schemas.microsoft.com/office/drawing/2016/5/14/chartex" xmlns:mc="http://schemas.openxmlformats.org/markup-compatibility/2006" xmlns:aink="http://schemas.microsoft.com/office/drawing/2016/ink" xmlns:am3d="http://schemas.microsoft.com/office/drawing/2017/model3d" xmlns:o="urn:schemas-microsoft-com:office:office" xmlns:oel="http://schemas.microsoft.com/office/2019/extlst" xmlns:r="http://schemas.openxmlformats.org/officeDocument/2006/relationships" xmlns:m="http://schemas.openxmlformats.org/officeDocument/2006/math" xmlns:v="urn:schemas-microsoft-com:vml" xmlns:wp14="http://schemas.microsoft.com/office/word/2010/wordprocessingDrawing" xmlns:wp="http://schemas.openxmlformats.org/drawingml/2006/wordprocessingDrawing" xmlns:w10="urn:schemas-microsoft-com:office:word" xmlns:w="http://schemas.openxmlformats.org/wordprocessingml/2006/main" xmlns:w14="http://schemas.microsoft.com/office/word/2010/wordml" xmlns:w15="http://schemas.microsoft.com/office/word/2012/wordml" xmlns:w16cex="http://schemas.microsoft.com/office/word/2018/wordml/cex" xmlns:w16cid="http://schemas.microsoft.com/office/word/2016/wordml/cid" xmlns:w16="http://schemas.microsoft.com/office/word/2018/wordml" xmlns:w16du="http://schemas.microsoft.com/office/word/2023/wordml/word16du" xmlns:w16sdtdh="http://schemas.microsoft.com/office/word/2020/wordml/sdtdatahash" xmlns:w16sdtfl="http://schemas.microsoft.com/office/word/2024/wordml/sdtformatlock" xmlns:w16se="http://schemas.microsoft.com/office/word/2015/wordml/symex" xmlns:wpg="http://schemas.microsoft.com/office/word/2010/wordprocessingGroup" xmlns:wpi="http://schemas.microsoft.com/office/word/2010/wordprocessingInk" xmlns:wne="http://schemas.microsoft.com/office/word/2006/wordml" xmlns:wps="http://schemas.microsoft.com/office/word/2010/wordprocessingShape" mc:Ignorable="w14 w15 w16se w16cid w16 w16cex w16sdtdh w16sdtfl w16du wp14">
+<w:hdr xmlns:wpc="http://schemas.microsoft.com/office/word/2010/wordprocessingCanvas" xmlns:cx="http://schemas.microsoft.com/office/drawing/2014/chartex" xmlns:cx1="http://schemas.microsoft.com/office/drawing/2015/9/8/chartex" xmlns:cx2="http://schemas.microsoft.com/office/drawing/2015/10/21/chartex" xmlns:cx3="http://schemas.microsoft.com/office/drawing/2016/5/9/chartex" xmlns:cx4="http://schemas.microsoft.com/office/drawing/2016/5/10/chartex" xmlns:cx5="http://schemas.microsoft.com/office/drawing/2016/5/11/chartex" xmlns:cx6="http://schemas.microsoft.com/office/drawing/2016/5/12/chartex" xmlns:cx7="http://schemas.microsoft.com/office/drawing/2016/5/13/chartex" xmlns:cx8="http://schemas.microsoft.com/office/drawing/2016/5/14/chartex" xmlns:mc="http://schemas.openxmlformats.org/markup-compatibility/2006" xmlns:aink="http://schemas.microsoft.com/office/drawing/2016/ink" xmlns:am3d="http://schemas.microsoft.com/office/drawing/2017/model3d" xmlns:o="urn:schemas-microsoft-com:office:office" xmlns:r="http://schemas.openxmlformats.org/officeDocument/2006/relationships" xmlns:m="http://schemas.openxmlformats.org/officeDocument/2006/math" xmlns:v="urn:schemas-microsoft-com:vml" xmlns:wp14="http://schemas.microsoft.com/office/word/2010/wordprocessingDrawing" xmlns:wp="http://schemas.openxmlformats.org/drawingml/2006/wordprocessingDrawing" xmlns:w10="urn:schemas-microsoft-com:office:word" xmlns:w="http://schemas.openxmlformats.org/wordprocessingml/2006/main" xmlns:w14="http://schemas.microsoft.com/office/word/2010/wordml" xmlns:w15="http://schemas.microsoft.com/office/word/2012/wordml" xmlns:w16cex="http://schemas.microsoft.com/office/word/2018/wordml/cex" xmlns:w16cid="http://schemas.microsoft.com/office/word/2016/wordml/cid" xmlns:w16="http://schemas.microsoft.com/office/word/2018/wordml" xmlns:w16sdtdh="http://schemas.microsoft.com/office/word/2020/wordml/sdtdatahash" xmlns:w16se="http://schemas.microsoft.com/office/word/2015/wordml/symex" xmlns:wpg="http://schemas.microsoft.com/office/word/2010/wordprocessingGroup" xmlns:wpi="http://schemas.microsoft.com/office/word/2010/wordprocessingInk" xmlns:wne="http://schemas.microsoft.com/office/word/2006/wordml" xmlns:wps="http://schemas.microsoft.com/office/word/2010/wordprocessingShape" mc:Ignorable="w14 w15 w16se w16cid w16 w16cex w16sdtdh wp14">
   <w:p>
     <w:pPr>
       <w:pStyle w:val="af3"/>
@@ -1067,7 +1206,7 @@
 </file>
 
 <file path=word/numbering.xml><?xml version="1.0" encoding="utf-8"?>
-<w:numbering xmlns:wpc="http://schemas.microsoft.com/office/word/2010/wordprocessingCanvas" xmlns:cx="http://schemas.microsoft.com/office/drawing/2014/chartex" xmlns:cx1="http://schemas.microsoft.com/office/drawing/2015/9/8/chartex" xmlns:cx2="http://schemas.microsoft.com/office/drawing/2015/10/21/chartex" xmlns:cx3="http://schemas.microsoft.com/office/drawing/2016/5/9/chartex" xmlns:cx4="http://schemas.microsoft.com/office/drawing/2016/5/10/chartex" xmlns:cx5="http://schemas.microsoft.com/office/drawing/2016/5/11/chartex" xmlns:cx6="http://schemas.microsoft.com/office/drawing/2016/5/12/chartex" xmlns:cx7="http://schemas.microsoft.com/office/drawing/2016/5/13/chartex" xmlns:cx8="http://schemas.microsoft.com/office/drawing/2016/5/14/chartex" xmlns:mc="http://schemas.openxmlformats.org/markup-compatibility/2006" xmlns:aink="http://schemas.microsoft.com/office/drawing/2016/ink" xmlns:am3d="http://schemas.microsoft.com/office/drawing/2017/model3d" xmlns:o="urn:schemas-microsoft-com:office:office" xmlns:oel="http://schemas.microsoft.com/office/2019/extlst" xmlns:r="http://schemas.openxmlformats.org/officeDocument/2006/relationships" xmlns:m="http://schemas.openxmlformats.org/officeDocument/2006/math" xmlns:v="urn:schemas-microsoft-com:vml" xmlns:wp14="http://schemas.microsoft.com/office/word/2010/wordprocessingDrawing" xmlns:wp="http://schemas.openxmlformats.org/drawingml/2006/wordprocessingDrawing" xmlns:w10="urn:schemas-microsoft-com:office:word" xmlns:w="http://schemas.openxmlformats.org/wordprocessingml/2006/main" xmlns:w14="http://schemas.microsoft.com/office/word/2010/wordml" xmlns:w15="http://schemas.microsoft.com/office/word/2012/wordml" xmlns:w16cex="http://schemas.microsoft.com/office/word/2018/wordml/cex" xmlns:w16cid="http://schemas.microsoft.com/office/word/2016/wordml/cid" xmlns:w16="http://schemas.microsoft.com/office/word/2018/wordml" xmlns:w16du="http://schemas.microsoft.com/office/word/2023/wordml/word16du" xmlns:w16sdtdh="http://schemas.microsoft.com/office/word/2020/wordml/sdtdatahash" xmlns:w16sdtfl="http://schemas.microsoft.com/office/word/2024/wordml/sdtformatlock" xmlns:w16se="http://schemas.microsoft.com/office/word/2015/wordml/symex" xmlns:wpg="http://schemas.microsoft.com/office/word/2010/wordprocessingGroup" xmlns:wpi="http://schemas.microsoft.com/office/word/2010/wordprocessingInk" xmlns:wne="http://schemas.microsoft.com/office/word/2006/wordml" xmlns:wps="http://schemas.microsoft.com/office/word/2010/wordprocessingShape" mc:Ignorable="w14 w15 w16se w16cid w16 w16cex w16sdtdh w16sdtfl w16du wp14">
+<w:numbering xmlns:wpc="http://schemas.microsoft.com/office/word/2010/wordprocessingCanvas" xmlns:cx="http://schemas.microsoft.com/office/drawing/2014/chartex" xmlns:cx1="http://schemas.microsoft.com/office/drawing/2015/9/8/chartex" xmlns:cx2="http://schemas.microsoft.com/office/drawing/2015/10/21/chartex" xmlns:cx3="http://schemas.microsoft.com/office/drawing/2016/5/9/chartex" xmlns:cx4="http://schemas.microsoft.com/office/drawing/2016/5/10/chartex" xmlns:cx5="http://schemas.microsoft.com/office/drawing/2016/5/11/chartex" xmlns:cx6="http://schemas.microsoft.com/office/drawing/2016/5/12/chartex" xmlns:cx7="http://schemas.microsoft.com/office/drawing/2016/5/13/chartex" xmlns:cx8="http://schemas.microsoft.com/office/drawing/2016/5/14/chartex" xmlns:mc="http://schemas.openxmlformats.org/markup-compatibility/2006" xmlns:aink="http://schemas.microsoft.com/office/drawing/2016/ink" xmlns:am3d="http://schemas.microsoft.com/office/drawing/2017/model3d" xmlns:o="urn:schemas-microsoft-com:office:office" xmlns:r="http://schemas.openxmlformats.org/officeDocument/2006/relationships" xmlns:m="http://schemas.openxmlformats.org/officeDocument/2006/math" xmlns:v="urn:schemas-microsoft-com:vml" xmlns:wp14="http://schemas.microsoft.com/office/word/2010/wordprocessingDrawing" xmlns:wp="http://schemas.openxmlformats.org/drawingml/2006/wordprocessingDrawing" xmlns:w10="urn:schemas-microsoft-com:office:word" xmlns:w="http://schemas.openxmlformats.org/wordprocessingml/2006/main" xmlns:w14="http://schemas.microsoft.com/office/word/2010/wordml" xmlns:w15="http://schemas.microsoft.com/office/word/2012/wordml" xmlns:w16cex="http://schemas.microsoft.com/office/word/2018/wordml/cex" xmlns:w16cid="http://schemas.microsoft.com/office/word/2016/wordml/cid" xmlns:w16="http://schemas.microsoft.com/office/word/2018/wordml" xmlns:w16sdtdh="http://schemas.microsoft.com/office/word/2020/wordml/sdtdatahash" xmlns:w16se="http://schemas.microsoft.com/office/word/2015/wordml/symex" xmlns:wpg="http://schemas.microsoft.com/office/word/2010/wordprocessingGroup" xmlns:wpi="http://schemas.microsoft.com/office/word/2010/wordprocessingInk" xmlns:wne="http://schemas.microsoft.com/office/word/2006/wordml" xmlns:wps="http://schemas.microsoft.com/office/word/2010/wordprocessingShape" mc:Ignorable="w14 w15 w16se w16cid w16 w16cex w16sdtdh wp14">
   <w:abstractNum w:abstractNumId="0" w15:restartNumberingAfterBreak="0">
     <w:nsid w:val="1EB4286B"/>
     <w:multiLevelType w:val="multilevel"/>
@@ -1303,17 +1442,17 @@
       </w:pPr>
     </w:lvl>
   </w:abstractNum>
-  <w:num w:numId="1" w16cid:durableId="198978623">
+  <w:num w:numId="1">
     <w:abstractNumId w:val="1"/>
   </w:num>
-  <w:num w:numId="2" w16cid:durableId="158271640">
+  <w:num w:numId="2">
     <w:abstractNumId w:val="0"/>
   </w:num>
 </w:numbering>
 </file>
 
 <file path=word/styles.xml><?xml version="1.0" encoding="utf-8"?>
-<w:styles xmlns:mc="http://schemas.openxmlformats.org/markup-compatibility/2006" xmlns:r="http://schemas.openxmlformats.org/officeDocument/2006/relationships" xmlns:w="http://schemas.openxmlformats.org/wordprocessingml/2006/main" xmlns:w14="http://schemas.microsoft.com/office/word/2010/wordml" xmlns:w15="http://schemas.microsoft.com/office/word/2012/wordml" xmlns:w16cex="http://schemas.microsoft.com/office/word/2018/wordml/cex" xmlns:w16cid="http://schemas.microsoft.com/office/word/2016/wordml/cid" xmlns:w16="http://schemas.microsoft.com/office/word/2018/wordml" xmlns:w16du="http://schemas.microsoft.com/office/word/2023/wordml/word16du" xmlns:w16sdtdh="http://schemas.microsoft.com/office/word/2020/wordml/sdtdatahash" xmlns:w16sdtfl="http://schemas.microsoft.com/office/word/2024/wordml/sdtformatlock" xmlns:w16se="http://schemas.microsoft.com/office/word/2015/wordml/symex" mc:Ignorable="w14 w15 w16se w16cid w16 w16cex w16sdtdh w16sdtfl w16du">
+<w:styles xmlns:mc="http://schemas.openxmlformats.org/markup-compatibility/2006" xmlns:r="http://schemas.openxmlformats.org/officeDocument/2006/relationships" xmlns:w="http://schemas.openxmlformats.org/wordprocessingml/2006/main" xmlns:w14="http://schemas.microsoft.com/office/word/2010/wordml" xmlns:w15="http://schemas.microsoft.com/office/word/2012/wordml" xmlns:w16cex="http://schemas.microsoft.com/office/word/2018/wordml/cex" xmlns:w16cid="http://schemas.microsoft.com/office/word/2016/wordml/cid" xmlns:w16="http://schemas.microsoft.com/office/word/2018/wordml" xmlns:w16sdtdh="http://schemas.microsoft.com/office/word/2020/wordml/sdtdatahash" xmlns:w16se="http://schemas.microsoft.com/office/word/2015/wordml/symex" mc:Ignorable="w14 w15 w16se w16cid w16 w16cex w16sdtdh">
   <w:docDefaults>
     <w:rPrDefault>
       <w:rPr>
@@ -2180,7 +2319,7 @@
       <w:spacing w:before="240" w:after="120"/>
     </w:pPr>
     <w:rPr>
-      <w:rFonts w:ascii="Liberation Sans" w:eastAsia="PingFang SC" w:hAnsi="Liberation Sans" w:cs="Arial Unicode MS"/>
+      <w:rFonts w:ascii="Liberation Sans" w:eastAsia="PINGFANG SC" w:hAnsi="Liberation Sans" w:cs="Arial Unicode MS"/>
       <w:sz w:val="28"/>
       <w:szCs w:val="28"/>
     </w:rPr>

</xml_diff>